<commit_message>
Update changelog and resume publications: sync verified citation metadata and enhance publication details in resumes.
</commit_message>
<xml_diff>
--- a/master/resume.docx
+++ b/master/resume.docx
@@ -837,7 +837,7 @@
         <w:t xml:space="preserve">•  </w:t>
       </w:r>
       <w:r>
-        <w:t>Temporal Relation Extraction using Apriori Algorithm.</w:t>
+        <w:t>Kadir, M., Sobhan, S., &amp; Islam, Z. (2016). Temporal Relation Extraction using Apriori Algorithm. 2016 5th International Conference on Informatics, Electronics and Vision (ICIEV), 915–920. DOI: 10.1109/ICIEV.2016.7760133</w:t>
       </w:r>
     </w:p>
     <w:p>
@@ -853,7 +853,7 @@
         <w:t xml:space="preserve">•  </w:t>
       </w:r>
       <w:r>
-        <w:t>An Effective Attendance Monitoring System with Fraud Prevention Technique for Educational Institutions.</w:t>
+        <w:t>Qaiduzzaman, K. M., Shahjahan, M., Sobhan, S., Arman, M. S., Taj Noor, M. B., &amp; Rahman, M. (2018). An Effective Attendance Monitoring System with Fraud Prevention Technique for Educational Institutions. International Journal of Engineering and Technology, 7(3), 1593–1598. DOI: 10.14419/ijet.v7i3.13974</w:t>
       </w:r>
     </w:p>
     <w:p>

</xml_diff>

<commit_message>
Update resumes, changelog, and achievements: enhance election management system details, improve metrics, and replace placeholder exports with tailored content across multiple resumes.
</commit_message>
<xml_diff>
--- a/master/resume.docx
+++ b/master/resume.docx
@@ -327,7 +327,7 @@
         <w:t xml:space="preserve">•  </w:t>
       </w:r>
       <w:r>
-        <w:t>Serve as backend team lead for an Election Management System, guiding grooming, planning, implementation, and code reviews within a 30-person development team.</w:t>
+        <w:t>Serve as backend team lead for an Election Management System, leading task distribution, grooming, planning, implementation, and code reviews within a 30-person development team.</w:t>
       </w:r>
     </w:p>
     <w:p>
@@ -343,7 +343,7 @@
         <w:t xml:space="preserve">•  </w:t>
       </w:r>
       <w:r>
-        <w:t>Design and implement secure, scalable backend services using Java, Spring Boot, Hibernate, and REST APIs across a microservices architecture of nearly 20 running services.</w:t>
+        <w:t>Design and implement secure, scalable backend services using Java, Spring Boot, Hibernate, and REST APIs across a microservices architecture of nearly 25 running services, including candidate-management and reporting services.</w:t>
       </w:r>
     </w:p>
     <w:p>
@@ -359,7 +359,7 @@
         <w:t xml:space="preserve">•  </w:t>
       </w:r>
       <w:r>
-        <w:t>Help deliver an internal system supporting 50,000 users, alongside a public-facing application that does not require authentication.</w:t>
+        <w:t>Help deliver an internal system supporting 50,000 users and approximately 100,000 daily requests during election periods, compared with approximately 10,000 requests per day before elections.</w:t>
       </w:r>
     </w:p>
     <w:p>
@@ -375,7 +375,7 @@
         <w:t xml:space="preserve">•  </w:t>
       </w:r>
       <w:r>
-        <w:t>Support deployments to the organization's self-managed data center using Kubernetes.</w:t>
+        <w:t>Contributed to approximately 30 deployments by writing Dockerfiles and diagnosing deployment failures in the organization's self-managed Kubernetes data center.</w:t>
       </w:r>
     </w:p>
     <w:p>
@@ -391,7 +391,7 @@
         <w:t xml:space="preserve">•  </w:t>
       </w:r>
       <w:r>
-        <w:t>Digitized election-result workflows that previously depended on paperwork and physical result delivery, enabling end-to-end processing in the system.</w:t>
+        <w:t>Digitized result-center, voter, candidate, and percentage-calculation workflows for approximately 300 returning officers; strengthened validation and task-specific access controls to prevent unwanted data changes.</w:t>
       </w:r>
     </w:p>
     <w:p>

</xml_diff>

<commit_message>
Update changelog, achievements, and resumes: add new evidence for Penta Global projects, enhance backend delivery descriptions, and update skills inventory with additional technologies.
</commit_message>
<xml_diff>
--- a/master/resume.docx
+++ b/master/resume.docx
@@ -195,7 +195,7 @@
           <w:color w:val="525860"/>
           <w:sz w:val="18"/>
         </w:rPr>
-        <w:t>Backend  |  Java, Spring Boot, Hibernate, REST APIs, backend architecture, distributed systems</w:t>
+        <w:t>Backend  |  Java, Spring Boot, Hibernate, Node.js, Express, REST APIs, PDF generation, backend architecture, distributed systems</w:t>
       </w:r>
     </w:p>
     <w:p>
@@ -209,7 +209,7 @@
           <w:color w:val="525860"/>
           <w:sz w:val="18"/>
         </w:rPr>
-        <w:t>Data  |  PostgreSQL, SQL Server, database modeling, query optimization, relational database design</w:t>
+        <w:t>Data  |  PostgreSQL, SQL Server, Flyway, database modeling, query optimization, relational database design</w:t>
       </w:r>
     </w:p>
     <w:p>
@@ -223,7 +223,7 @@
           <w:color w:val="525860"/>
           <w:sz w:val="18"/>
         </w:rPr>
-        <w:t>Security  |  Keycloak, authentication, authorization, data privacy, data integrity</w:t>
+        <w:t>Security  |  Keycloak, JWT token introspection, role-based authorization, data privacy, data integrity</w:t>
       </w:r>
     </w:p>
     <w:p>
@@ -343,7 +343,23 @@
         <w:t xml:space="preserve">•  </w:t>
       </w:r>
       <w:r>
-        <w:t>Design and implement secure, scalable backend services using Java, Spring Boot, Hibernate, and REST APIs across a microservices architecture of nearly 25 running services, including candidate-management and reporting services.</w:t>
+        <w:t>Led backend delivery for candidate review, nomination lifecycle, verification, status-transition, and payment-linked submission workflows handling sensitive identity, disclosure, and election data.</w:t>
+      </w:r>
+    </w:p>
+    <w:p>
+      <w:pPr>
+        <w:spacing w:after="36" w:line="245" w:lineRule="auto"/>
+        <w:ind w:left="245" w:hanging="187"/>
+        <w:keepLines/>
+      </w:pPr>
+      <w:r>
+        <w:rPr>
+          <w:color w:val="1B375C"/>
+        </w:rPr>
+        <w:t xml:space="preserve">•  </w:t>
+      </w:r>
+      <w:r>
+        <w:t>Owned a reporting service that composed data from multiple election services to generate official nomination, candidate, schedule, and result PDF reports.</w:t>
       </w:r>
     </w:p>
     <w:p>
@@ -391,7 +407,7 @@
         <w:t xml:space="preserve">•  </w:t>
       </w:r>
       <w:r>
-        <w:t>Digitized result-center, voter, candidate, and percentage-calculation workflows for approximately 300 returning officers; strengthened validation and task-specific access controls to prevent unwanted data changes.</w:t>
+        <w:t>Digitized result-center, voter, candidate, and percentage-calculation workflows for approximately 300 returning officers; strengthened validation and role-based controls to prevent unwanted data changes.</w:t>
       </w:r>
     </w:p>
     <w:p>

</xml_diff>

<commit_message>
Update resumes and scripts: add GitHub profile links to multiple resumes and enhance resume generation script to include GitHub links.
</commit_message>
<xml_diff>
--- a/master/resume.docx
+++ b/master/resume.docx
@@ -98,6 +98,20 @@
           <w:sz w:val="18"/>
         </w:rPr>
         <w:t>Website: www.sadmansobhan.com</w:t>
+      </w:r>
+    </w:p>
+    <w:p>
+      <w:pPr>
+        <w:spacing w:after="0"/>
+        <w:jc w:val="center"/>
+      </w:pPr>
+      <w:r>
+        <w:rPr>
+          <w:b w:val="0"/>
+          <w:color w:val="525860"/>
+          <w:sz w:val="18"/>
+        </w:rPr>
+        <w:t>GitHub: github.com/imran110219</w:t>
       </w:r>
     </w:p>
     <w:p>

</xml_diff>

<commit_message>
Update resumes and changelog: remove Pranon internship, simplify education and language sections, and enhance overall resume content.
</commit_message>
<xml_diff>
--- a/master/resume.docx
+++ b/master/resume.docx
@@ -723,57 +723,6 @@
     </w:p>
     <w:p>
       <w:pPr>
-        <w:pStyle w:val="DesignedSubsection"/>
-        <w:spacing w:before="90" w:after="10"/>
-        <w:keepNext/>
-      </w:pPr>
-      <w:r>
-        <w:t>Pranon - Student Intern</w:t>
-      </w:r>
-    </w:p>
-    <w:p>
-      <w:pPr>
-        <w:spacing w:after="40"/>
-        <w:keepLines/>
-      </w:pPr>
-      <w:r>
-        <w:t>Khulna, Bangladesh | June 2014 - September 2014</w:t>
-      </w:r>
-    </w:p>
-    <w:p>
-      <w:pPr>
-        <w:spacing w:after="36" w:line="245" w:lineRule="auto"/>
-        <w:ind w:left="245" w:hanging="187"/>
-        <w:keepLines/>
-      </w:pPr>
-      <w:r>
-        <w:rPr>
-          <w:color w:val="1B375C"/>
-        </w:rPr>
-        <w:t xml:space="preserve">•  </w:t>
-      </w:r>
-      <w:r>
-        <w:t>Worked as a WordPress developer, implementing features and fixing bugs in an education application.</w:t>
-      </w:r>
-    </w:p>
-    <w:p>
-      <w:pPr>
-        <w:spacing w:after="36" w:line="245" w:lineRule="auto"/>
-        <w:ind w:left="245" w:hanging="187"/>
-        <w:keepLines/>
-      </w:pPr>
-      <w:r>
-        <w:rPr>
-          <w:color w:val="1B375C"/>
-        </w:rPr>
-        <w:t xml:space="preserve">•  </w:t>
-      </w:r>
-      <w:r>
-        <w:t>Gained hands-on experience with WordPress CMS, PHP, and basic frontend development.</w:t>
-      </w:r>
-    </w:p>
-    <w:p>
-      <w:pPr>
         <w:pStyle w:val="DesignedSection"/>
         <w:spacing w:before="140" w:after="60"/>
         <w:pBdr>
@@ -787,58 +736,29 @@
     </w:p>
     <w:p>
       <w:pPr>
-        <w:spacing w:after="26" w:line="240" w:lineRule="auto"/>
+        <w:spacing w:after="40"/>
         <w:keepLines/>
       </w:pPr>
       <w:r>
-        <w:rPr>
-          <w:b w:val="0"/>
-          <w:color w:val="525860"/>
-          <w:sz w:val="18"/>
-        </w:rPr>
-        <w:t>Institution  |  Credential  |  Dates</w:t>
+        <w:t>Khulna University</w:t>
       </w:r>
     </w:p>
     <w:p>
       <w:pPr>
-        <w:spacing w:after="26" w:line="240" w:lineRule="auto"/>
+        <w:spacing w:after="40"/>
         <w:keepLines/>
       </w:pPr>
       <w:r>
-        <w:rPr>
-          <w:b w:val="0"/>
-          <w:color w:val="525860"/>
-          <w:sz w:val="18"/>
-        </w:rPr>
-        <w:t>Khulna University  |  Bachelor of Science, Computer Science and Engineering  |  2011 - 2016</w:t>
+        <w:t>Bachelor of Science (B.Sc.) in Computer Science and Engineering</w:t>
       </w:r>
     </w:p>
     <w:p>
       <w:pPr>
-        <w:spacing w:after="26" w:line="240" w:lineRule="auto"/>
+        <w:spacing w:after="40"/>
         <w:keepLines/>
       </w:pPr>
       <w:r>
-        <w:rPr>
-          <w:b w:val="0"/>
-          <w:color w:val="525860"/>
-          <w:sz w:val="18"/>
-        </w:rPr>
-        <w:t>Shaheed Mashiur Rahman Degree College  |  Higher Secondary School Certificate, Science  |  2008 - 2010</w:t>
-      </w:r>
-    </w:p>
-    <w:p>
-      <w:pPr>
-        <w:spacing w:after="26" w:line="240" w:lineRule="auto"/>
-        <w:keepLines/>
-      </w:pPr>
-      <w:r>
-        <w:rPr>
-          <w:b w:val="0"/>
-          <w:color w:val="525860"/>
-          <w:sz w:val="18"/>
-        </w:rPr>
-        <w:t>Jhikargacha M. L. High School  |  Secondary School Certificate, Science  |  2003 - 2008</w:t>
+        <w:t>2011–2016</w:t>
       </w:r>
     </w:p>
     <w:p>
@@ -896,7 +816,7 @@
         <w:keepNext/>
       </w:pPr>
       <w:r>
-        <w:t>CERTIFICATIONS</w:t>
+        <w:t>LANGUAGES</w:t>
       </w:r>
     </w:p>
     <w:p>
@@ -912,7 +832,7 @@
         <w:t xml:space="preserve">•  </w:t>
       </w:r>
       <w:r>
-        <w:t>Python 3 Tutorial Course.</w:t>
+        <w:t>Bangla — Native</w:t>
       </w:r>
     </w:p>
     <w:p>
@@ -928,169 +848,7 @@
         <w:t xml:space="preserve">•  </w:t>
       </w:r>
       <w:r>
-        <w:t>Foundations of IT Security: Core Concepts.</w:t>
-      </w:r>
-    </w:p>
-    <w:p>
-      <w:pPr>
-        <w:spacing w:after="36" w:line="245" w:lineRule="auto"/>
-        <w:ind w:left="245" w:hanging="187"/>
-        <w:keepLines/>
-      </w:pPr>
-      <w:r>
-        <w:rPr>
-          <w:color w:val="1B375C"/>
-        </w:rPr>
-        <w:t xml:space="preserve">•  </w:t>
-      </w:r>
-      <w:r>
-        <w:t>Internet History, Technology, and Security.</w:t>
-      </w:r>
-    </w:p>
-    <w:p>
-      <w:pPr>
-        <w:spacing w:after="36" w:line="245" w:lineRule="auto"/>
-        <w:ind w:left="245" w:hanging="187"/>
-        <w:keepLines/>
-      </w:pPr>
-      <w:r>
-        <w:rPr>
-          <w:color w:val="1B375C"/>
-        </w:rPr>
-        <w:t xml:space="preserve">•  </w:t>
-      </w:r>
-      <w:r>
-        <w:t>Java Course.</w:t>
-      </w:r>
-    </w:p>
-    <w:p>
-      <w:pPr>
-        <w:spacing w:after="36" w:line="245" w:lineRule="auto"/>
-        <w:ind w:left="245" w:hanging="187"/>
-        <w:keepLines/>
-      </w:pPr>
-      <w:r>
-        <w:rPr>
-          <w:color w:val="1B375C"/>
-        </w:rPr>
-        <w:t xml:space="preserve">•  </w:t>
-      </w:r>
-      <w:r>
-        <w:t>Intro to Python for Data Science Course.</w:t>
-      </w:r>
-    </w:p>
-    <w:p>
-      <w:pPr>
-        <w:pStyle w:val="DesignedSection"/>
-        <w:spacing w:before="140" w:after="60"/>
-        <w:pBdr>
-          <w:bottom w:val="single" w:sz="8" w:space="5" w:color="1B375C"/>
-        </w:pBdr>
-        <w:keepNext/>
-      </w:pPr>
-      <w:r>
-        <w:t>LANGUAGES</w:t>
-      </w:r>
-    </w:p>
-    <w:p>
-      <w:pPr>
-        <w:spacing w:after="26" w:line="240" w:lineRule="auto"/>
-        <w:keepLines/>
-      </w:pPr>
-      <w:r>
-        <w:rPr>
-          <w:b w:val="0"/>
-          <w:color w:val="525860"/>
-          <w:sz w:val="18"/>
-        </w:rPr>
-        <w:t>Language  |  Proficiency</w:t>
-      </w:r>
-    </w:p>
-    <w:p>
-      <w:pPr>
-        <w:spacing w:after="26" w:line="240" w:lineRule="auto"/>
-        <w:keepLines/>
-      </w:pPr>
-      <w:r>
-        <w:rPr>
-          <w:b w:val="0"/>
-          <w:color w:val="525860"/>
-          <w:sz w:val="18"/>
-        </w:rPr>
-        <w:t>Bangla  |  Native or bilingual</w:t>
-      </w:r>
-    </w:p>
-    <w:p>
-      <w:pPr>
-        <w:spacing w:after="26" w:line="240" w:lineRule="auto"/>
-        <w:keepLines/>
-      </w:pPr>
-      <w:r>
-        <w:rPr>
-          <w:b w:val="0"/>
-          <w:color w:val="525860"/>
-          <w:sz w:val="18"/>
-        </w:rPr>
-        <w:t>English  |  Professional working</w:t>
-      </w:r>
-    </w:p>
-    <w:p>
-      <w:pPr>
-        <w:spacing w:after="26" w:line="240" w:lineRule="auto"/>
-        <w:keepLines/>
-      </w:pPr>
-      <w:r>
-        <w:rPr>
-          <w:b w:val="0"/>
-          <w:color w:val="525860"/>
-          <w:sz w:val="18"/>
-        </w:rPr>
-        <w:t>Hindi  |  Limited working</w:t>
-      </w:r>
-    </w:p>
-    <w:p>
-      <w:pPr>
-        <w:pStyle w:val="DesignedSection"/>
-        <w:spacing w:before="140" w:after="60"/>
-        <w:pBdr>
-          <w:bottom w:val="single" w:sz="8" w:space="5" w:color="1B375C"/>
-        </w:pBdr>
-        <w:keepNext/>
-      </w:pPr>
-      <w:r>
-        <w:t>HONORS AND AWARDS</w:t>
-      </w:r>
-    </w:p>
-    <w:p>
-      <w:pPr>
-        <w:spacing w:after="36" w:line="245" w:lineRule="auto"/>
-        <w:ind w:left="245" w:hanging="187"/>
-        <w:keepLines/>
-      </w:pPr>
-      <w:r>
-        <w:rPr>
-          <w:color w:val="1B375C"/>
-        </w:rPr>
-        <w:t xml:space="preserve">•  </w:t>
-      </w:r>
-      <w:r>
-        <w:t>Junior Scholarship.</w:t>
-      </w:r>
-    </w:p>
-    <w:p>
-      <w:pPr>
-        <w:spacing w:after="36" w:line="245" w:lineRule="auto"/>
-        <w:ind w:left="245" w:hanging="187"/>
-        <w:keepLines/>
-      </w:pPr>
-      <w:r>
-        <w:rPr>
-          <w:color w:val="1B375C"/>
-        </w:rPr>
-        <w:t xml:space="preserve">•  </w:t>
-      </w:r>
-      <w:r>
-        <w:t>GPA-5 (A+).</w:t>
+        <w:t>English — Professional Working Proficiency</w:t>
       </w:r>
     </w:p>
     <w:sectPr>

</xml_diff>

<commit_message>
Update resumes and changelog: standardize education entry format across all resumes and enhance resume generation script for improved parsing.
</commit_message>
<xml_diff>
--- a/master/resume.docx
+++ b/master/resume.docx
@@ -740,25 +740,7 @@
         <w:keepLines/>
       </w:pPr>
       <w:r>
-        <w:t>Khulna University</w:t>
-      </w:r>
-    </w:p>
-    <w:p>
-      <w:pPr>
-        <w:spacing w:after="40"/>
-        <w:keepLines/>
-      </w:pPr>
-      <w:r>
-        <w:t>Bachelor of Science (B.Sc.) in Computer Science and Engineering</w:t>
-      </w:r>
-    </w:p>
-    <w:p>
-      <w:pPr>
-        <w:spacing w:after="40"/>
-        <w:keepLines/>
-      </w:pPr>
-      <w:r>
-        <w:t>2011–2016</w:t>
+        <w:t>Khulna University | Bachelor of Science (B.Sc.) in Computer Science and Engineering | 2011–2016</w:t>
       </w:r>
     </w:p>
     <w:p>

</xml_diff>

<commit_message>
Update resumes and changelog: enhance role-specific resumes with strengthened evidence, improve master resume's backend positioning, and update skills inventory with additional technologies.
</commit_message>
<xml_diff>
--- a/master/resume.docx
+++ b/master/resume.docx
@@ -27,7 +27,7 @@
           <w:color w:val="1B375C"/>
           <w:sz w:val="20"/>
         </w:rPr>
-        <w:t>Senior Software Engineer | Backend &amp; Distributed Systems | Java, Spring Boot, PostgreSQL</w:t>
+        <w:t>Senior Backend Engineer | Java, Spring Boot, Distributed Systems, PostgreSQL, Microservices</w:t>
       </w:r>
     </w:p>
     <w:p>
@@ -150,7 +150,7 @@
         <w:keepLines/>
       </w:pPr>
       <w:r>
-        <w:t>Senior Software Engineer with 9+ years of experience designing and building secure, scalable backend systems across healthcare, government, education, and enterprise domains. Strong in Java, Spring Boot, backend architecture, distributed systems, API design, database modeling, and performance optimization.</w:t>
+        <w:t>Senior Backend Engineer with 9+ years of experience designing secure, scalable backend platforms across government, healthcare, education, and enterprise domains. Specialized in Java, Spring Boot, PostgreSQL, distributed systems, REST APIs, backend architecture, and performance optimization.</w:t>
       </w:r>
     </w:p>
     <w:p>
@@ -159,16 +159,116 @@
         <w:keepLines/>
       </w:pPr>
       <w:r>
-        <w:t>Experienced in platforms used by thousands of users where reliability, data integrity, and security are critical. Proven ability to lead and mentor engineering teams, contribute to system design decisions, and own software delivery from requirements and architecture through deployment and long-term maintenance.</w:t>
+        <w:t>Experienced leading backend engineering work, designing security- and data-integrity-sensitive systems, and delivering software supporting thousands of users. Brings hands-on ownership from requirements and architecture through deployment and long-term maintenance.</w:t>
       </w:r>
     </w:p>
     <w:p>
       <w:pPr>
-        <w:spacing w:after="40"/>
+        <w:pStyle w:val="DesignedSection"/>
+        <w:spacing w:before="140" w:after="60"/>
+        <w:pBdr>
+          <w:bottom w:val="single" w:sz="8" w:space="5" w:color="1B375C"/>
+        </w:pBdr>
+        <w:keepNext/>
+      </w:pPr>
+      <w:r>
+        <w:t>CAREER HIGHLIGHTS</w:t>
+      </w:r>
+    </w:p>
+    <w:p>
+      <w:pPr>
+        <w:spacing w:after="36" w:line="245" w:lineRule="auto"/>
+        <w:ind w:left="245" w:hanging="187"/>
         <w:keepLines/>
       </w:pPr>
       <w:r>
-        <w:t>Currently expanding deeper expertise in DevOps, SRE practices, and cloud-native distributed systems while building health-tech platforms that improve how patients, doctors, and organizations connect in Bangladesh.</w:t>
+        <w:rPr>
+          <w:color w:val="1B375C"/>
+        </w:rPr>
+        <w:t xml:space="preserve">•  </w:t>
+      </w:r>
+      <w:r>
+        <w:t>9+ years of backend engineering experience across government, healthcare, education, and enterprise domains.</w:t>
+      </w:r>
+    </w:p>
+    <w:p>
+      <w:pPr>
+        <w:spacing w:after="36" w:line="245" w:lineRule="auto"/>
+        <w:ind w:left="245" w:hanging="187"/>
+        <w:keepLines/>
+      </w:pPr>
+      <w:r>
+        <w:rPr>
+          <w:color w:val="1B375C"/>
+        </w:rPr>
+        <w:t xml:space="preserve">•  </w:t>
+      </w:r>
+      <w:r>
+        <w:t>Led backend delivery activities, including task allocation, planning, implementation guidance, and code reviews, within a 30-person development team.</w:t>
+      </w:r>
+    </w:p>
+    <w:p>
+      <w:pPr>
+        <w:spacing w:after="36" w:line="245" w:lineRule="auto"/>
+        <w:ind w:left="245" w:hanging="187"/>
+        <w:keepLines/>
+      </w:pPr>
+      <w:r>
+        <w:rPr>
+          <w:color w:val="1B375C"/>
+        </w:rPr>
+        <w:t xml:space="preserve">•  </w:t>
+      </w:r>
+      <w:r>
+        <w:t>Helped deliver an election-management platform supporting 50,000 users and approximately 100,000 daily requests during election periods.</w:t>
+      </w:r>
+    </w:p>
+    <w:p>
+      <w:pPr>
+        <w:spacing w:after="36" w:line="245" w:lineRule="auto"/>
+        <w:ind w:left="245" w:hanging="187"/>
+        <w:keepLines/>
+      </w:pPr>
+      <w:r>
+        <w:rPr>
+          <w:color w:val="1B375C"/>
+        </w:rPr>
+        <w:t xml:space="preserve">•  </w:t>
+      </w:r>
+      <w:r>
+        <w:t>Designed and delivered services across a microservices architecture of nearly 25 running services.</w:t>
+      </w:r>
+    </w:p>
+    <w:p>
+      <w:pPr>
+        <w:spacing w:after="36" w:line="245" w:lineRule="auto"/>
+        <w:ind w:left="245" w:hanging="187"/>
+        <w:keepLines/>
+      </w:pPr>
+      <w:r>
+        <w:rPr>
+          <w:color w:val="1B375C"/>
+        </w:rPr>
+        <w:t xml:space="preserve">•  </w:t>
+      </w:r>
+      <w:r>
+        <w:t>Reduced exam-management system response time by 30% through Redis caching and backend performance improvements.</w:t>
+      </w:r>
+    </w:p>
+    <w:p>
+      <w:pPr>
+        <w:spacing w:after="36" w:line="245" w:lineRule="auto"/>
+        <w:ind w:left="245" w:hanging="187"/>
+        <w:keepLines/>
+      </w:pPr>
+      <w:r>
+        <w:rPr>
+          <w:color w:val="1B375C"/>
+        </w:rPr>
+        <w:t xml:space="preserve">•  </w:t>
+      </w:r>
+      <w:r>
+        <w:t>Co-authored two peer-reviewed research publications.</w:t>
       </w:r>
     </w:p>
     <w:p>
@@ -209,7 +309,7 @@
           <w:color w:val="525860"/>
           <w:sz w:val="18"/>
         </w:rPr>
-        <w:t>Backend  |  Java, Spring Boot, Hibernate, Node.js, Express, REST APIs, PDF generation, backend architecture, distributed systems</w:t>
+        <w:t>Languages  |  Java, SQL, C#</w:t>
       </w:r>
     </w:p>
     <w:p>
@@ -223,7 +323,35 @@
           <w:color w:val="525860"/>
           <w:sz w:val="18"/>
         </w:rPr>
-        <w:t>Data  |  PostgreSQL, SQL Server, Flyway, database modeling, query optimization, relational database design</w:t>
+        <w:t>Backend  |  Spring Boot, Hibernate, REST APIs, Node.js, Express, PDF generation</w:t>
+      </w:r>
+    </w:p>
+    <w:p>
+      <w:pPr>
+        <w:spacing w:after="26" w:line="240" w:lineRule="auto"/>
+        <w:keepLines/>
+      </w:pPr>
+      <w:r>
+        <w:rPr>
+          <w:b w:val="0"/>
+          <w:color w:val="525860"/>
+          <w:sz w:val="18"/>
+        </w:rPr>
+        <w:t>Architecture  |  Microservices, distributed systems, backend architecture, API design, database modeling</w:t>
+      </w:r>
+    </w:p>
+    <w:p>
+      <w:pPr>
+        <w:spacing w:after="26" w:line="240" w:lineRule="auto"/>
+        <w:keepLines/>
+      </w:pPr>
+      <w:r>
+        <w:rPr>
+          <w:b w:val="0"/>
+          <w:color w:val="525860"/>
+          <w:sz w:val="18"/>
+        </w:rPr>
+        <w:t>Data &amp; Performance  |  PostgreSQL, SQL Server, Redis, Flyway, query optimization, relational database design</w:t>
       </w:r>
     </w:p>
     <w:p>
@@ -251,7 +379,7 @@
           <w:color w:val="525860"/>
           <w:sz w:val="18"/>
         </w:rPr>
-        <w:t>Performance  |  Redis caching, performance optimization, scalable service design</w:t>
+        <w:t>Infrastructure  |  Docker, Kubernetes, deployment troubleshooting</w:t>
       </w:r>
     </w:p>
     <w:p>
@@ -265,35 +393,7 @@
           <w:color w:val="525860"/>
           <w:sz w:val="18"/>
         </w:rPr>
-        <w:t>Delivery  |  Agile development, requirement analysis, deployment, maintenance, code reviews</w:t>
-      </w:r>
-    </w:p>
-    <w:p>
-      <w:pPr>
-        <w:spacing w:after="26" w:line="240" w:lineRule="auto"/>
-        <w:keepLines/>
-      </w:pPr>
-      <w:r>
-        <w:rPr>
-          <w:b w:val="0"/>
-          <w:color w:val="525860"/>
-          <w:sz w:val="18"/>
-        </w:rPr>
-        <w:t>Leadership  |  Team leadership, mentoring, grooming, planning, stakeholder collaboration</w:t>
-      </w:r>
-    </w:p>
-    <w:p>
-      <w:pPr>
-        <w:spacing w:after="26" w:line="240" w:lineRule="auto"/>
-        <w:keepLines/>
-      </w:pPr>
-      <w:r>
-        <w:rPr>
-          <w:b w:val="0"/>
-          <w:color w:val="525860"/>
-          <w:sz w:val="18"/>
-        </w:rPr>
-        <w:t>Additional  |  Flutter, Crystal Reports, ASP.NET, C#, WordPress, PHP</w:t>
+        <w:t>Leadership &amp; Delivery  |  Technical leadership, mentoring, grooming, planning, code reviews, stakeholder collaboration, Agile development</w:t>
       </w:r>
     </w:p>
     <w:p>
@@ -341,7 +441,23 @@
         <w:t xml:space="preserve">•  </w:t>
       </w:r>
       <w:r>
-        <w:t>Serve as backend team lead for an Election Management System, leading task distribution, grooming, planning, implementation, and code reviews within a 30-person development team.</w:t>
+        <w:t>Led backend engineering activities for an Election Management System, including task allocation, grooming, planning, implementation guidance, and code reviews within a 30-person development team.</w:t>
+      </w:r>
+    </w:p>
+    <w:p>
+      <w:pPr>
+        <w:spacing w:after="36" w:line="245" w:lineRule="auto"/>
+        <w:ind w:left="245" w:hanging="187"/>
+        <w:keepLines/>
+      </w:pPr>
+      <w:r>
+        <w:rPr>
+          <w:color w:val="1B375C"/>
+        </w:rPr>
+        <w:t xml:space="preserve">•  </w:t>
+      </w:r>
+      <w:r>
+        <w:t>Key technologies: Java, Spring Boot, Hibernate, REST APIs, Docker, Kubernetes, Keycloak.</w:t>
       </w:r>
     </w:p>
     <w:p>
@@ -373,7 +489,7 @@
         <w:t xml:space="preserve">•  </w:t>
       </w:r>
       <w:r>
-        <w:t>Owned a reporting service that composed data from multiple election services to generate official nomination, candidate, schedule, and result PDF reports.</w:t>
+        <w:t>Designed service interactions, REST API contracts, and reporting workflows across a microservices architecture of nearly 25 services; owned a reporting service that consolidated data to generate official nomination, candidate, schedule, and result PDF reports.</w:t>
       </w:r>
     </w:p>
     <w:p>
@@ -457,6 +573,22 @@
       </w:r>
       <w:r>
         <w:t>Led development of an exam management system using Java, PostgreSQL, Spring Boot, Flutter, and Crystal Reports.</w:t>
+      </w:r>
+    </w:p>
+    <w:p>
+      <w:pPr>
+        <w:spacing w:after="36" w:line="245" w:lineRule="auto"/>
+        <w:ind w:left="245" w:hanging="187"/>
+        <w:keepLines/>
+      </w:pPr>
+      <w:r>
+        <w:rPr>
+          <w:color w:val="1B375C"/>
+        </w:rPr>
+        <w:t xml:space="preserve">•  </w:t>
+      </w:r>
+      <w:r>
+        <w:t>Key technologies: Java, Spring Boot, PostgreSQL, Redis, Flutter, Crystal Reports.</w:t>
       </w:r>
     </w:p>
     <w:p>
@@ -587,6 +719,22 @@
         <w:t xml:space="preserve">•  </w:t>
       </w:r>
       <w:r>
+        <w:t>Key technologies: Java, relational data modeling, large-file uploads, enterprise workflows.</w:t>
+      </w:r>
+    </w:p>
+    <w:p>
+      <w:pPr>
+        <w:spacing w:after="36" w:line="245" w:lineRule="auto"/>
+        <w:ind w:left="245" w:hanging="187"/>
+        <w:keepLines/>
+      </w:pPr>
+      <w:r>
+        <w:rPr>
+          <w:color w:val="1B375C"/>
+        </w:rPr>
+        <w:t xml:space="preserve">•  </w:t>
+      </w:r>
+      <w:r>
         <w:t>Contributed to electronic government procurement capabilities involving large file uploads, relational data modeling, and enterprise-grade workflow support.</w:t>
       </w:r>
     </w:p>
@@ -686,6 +834,22 @@
         <w:t xml:space="preserve">•  </w:t>
       </w:r>
       <w:r>
+        <w:t>Key technologies: ASP.NET, C#, SQL Server.</w:t>
+      </w:r>
+    </w:p>
+    <w:p>
+      <w:pPr>
+        <w:spacing w:after="36" w:line="245" w:lineRule="auto"/>
+        <w:ind w:left="245" w:hanging="187"/>
+        <w:keepLines/>
+      </w:pPr>
+      <w:r>
+        <w:rPr>
+          <w:color w:val="1B375C"/>
+        </w:rPr>
+        <w:t xml:space="preserve">•  </w:t>
+      </w:r>
+      <w:r>
         <w:t>Developed and maintained SQL Server databases, including stored procedures, triggers, and views.</w:t>
       </w:r>
     </w:p>
@@ -769,7 +933,7 @@
         <w:t xml:space="preserve">•  </w:t>
       </w:r>
       <w:r>
-        <w:t>Kadir, M., Sobhan, S., &amp; Islam, Z. (2016). Temporal Relation Extraction using Apriori Algorithm. 2016 5th International Conference on Informatics, Electronics and Vision (ICIEV), 915–920. DOI: 10.1109/ICIEV.2016.7760133</w:t>
+        <w:t>Temporal Relation Extraction using Apriori Algorithm — ICIEV, 2016.</w:t>
       </w:r>
     </w:p>
     <w:p>
@@ -785,7 +949,7 @@
         <w:t xml:space="preserve">•  </w:t>
       </w:r>
       <w:r>
-        <w:t>Qaiduzzaman, K. M., Shahjahan, M., Sobhan, S., Arman, M. S., Taj Noor, M. B., &amp; Rahman, M. (2018). An Effective Attendance Monitoring System with Fraud Prevention Technique for Educational Institutions. International Journal of Engineering and Technology, 7(3), 1593–1598. DOI: 10.14419/ijet.v7i3.13974</w:t>
+        <w:t>An Effective Attendance Monitoring System with Fraud Prevention Technique for Educational Institutions — International Journal of Engineering and Technology, 2018.</w:t>
       </w:r>
     </w:p>
     <w:p>

</xml_diff>

<commit_message>
Update changelog and project documentation: sync Open-Care and FactLens projects, add Exam Management System entry, and remove certification review item from master resume.
</commit_message>
<xml_diff>
--- a/master/resume.docx
+++ b/master/resume.docx
@@ -895,6 +895,87 @@
         <w:keepNext/>
       </w:pPr>
       <w:r>
+        <w:t>SELECTED PROJECTS</w:t>
+      </w:r>
+    </w:p>
+    <w:p>
+      <w:pPr>
+        <w:pStyle w:val="DesignedSubsection"/>
+        <w:spacing w:before="90" w:after="10"/>
+        <w:keepNext/>
+      </w:pPr>
+      <w:r>
+        <w:t>Open-Care | Java, Spring Boot, PostgreSQL, Next.js</w:t>
+      </w:r>
+    </w:p>
+    <w:p>
+      <w:pPr>
+        <w:spacing w:after="36" w:line="245" w:lineRule="auto"/>
+        <w:ind w:left="245" w:hanging="187"/>
+        <w:keepLines/>
+      </w:pPr>
+      <w:r>
+        <w:rPr>
+          <w:color w:val="1B375C"/>
+        </w:rPr>
+        <w:t xml:space="preserve">•  </w:t>
+      </w:r>
+      <w:r>
+        <w:t>Lead contributor to an open-source healthcare-information platform providing searchable doctor, hospital, ambulance, blood-donation, and medical-resource capabilities.</w:t>
+      </w:r>
+    </w:p>
+    <w:p>
+      <w:pPr>
+        <w:spacing w:after="36" w:line="245" w:lineRule="auto"/>
+        <w:ind w:left="245" w:hanging="187"/>
+        <w:keepLines/>
+      </w:pPr>
+      <w:r>
+        <w:rPr>
+          <w:color w:val="1B375C"/>
+        </w:rPr>
+        <w:t xml:space="preserve">•  </w:t>
+      </w:r>
+      <w:r>
+        <w:t>Built and documented a Spring Boot REST API with PostgreSQL, Keycloak-based JWT authorization, MinIO file storage, Liquibase migrations, Dockerized deployment, and Swagger/OpenAPI documentation.</w:t>
+      </w:r>
+    </w:p>
+    <w:p>
+      <w:pPr>
+        <w:pStyle w:val="DesignedSubsection"/>
+        <w:spacing w:before="90" w:after="10"/>
+        <w:keepNext/>
+      </w:pPr>
+      <w:r>
+        <w:t>FactLens | Headless CMS, Custom Content Models, API Integration</w:t>
+      </w:r>
+    </w:p>
+    <w:p>
+      <w:pPr>
+        <w:spacing w:after="36" w:line="245" w:lineRule="auto"/>
+        <w:ind w:left="245" w:hanging="187"/>
+        <w:keepLines/>
+      </w:pPr>
+      <w:r>
+        <w:rPr>
+          <w:color w:val="1B375C"/>
+        </w:rPr>
+        <w:t xml:space="preserve">•  </w:t>
+      </w:r>
+      <w:r>
+        <w:t>Built and deployed a production editorial platform using a headless CMS architecture with customized content models and API integration.</w:t>
+      </w:r>
+    </w:p>
+    <w:p>
+      <w:pPr>
+        <w:pStyle w:val="DesignedSection"/>
+        <w:spacing w:before="140" w:after="60"/>
+        <w:pBdr>
+          <w:bottom w:val="single" w:sz="8" w:space="5" w:color="1B375C"/>
+        </w:pBdr>
+        <w:keepNext/>
+      </w:pPr>
+      <w:r>
         <w:t>EDUCATION</w:t>
       </w:r>
     </w:p>

</xml_diff>

<commit_message>
Refactor resumes and scripts for improved contact management and evidence tracking
- Updated resume markdown files for senior backend and software architect roles to use dynamic contact placeholders.
- Enhanced build scripts to load contact information from configuration files, allowing for public and private contact management.
- Introduced new YAML configuration files for private and public contact details.
- Created job search and application tracking configurations, including a CSV tracker and a checklist for application materials.
- Established evidence and experience inventories to maintain verified career context and project details.
- Added project deep dives and interview preparation materials to support candidate readiness.
- Implemented a skills inventory to ensure only current and relevant skills are included in resumes.
- Documented workflows and contributing guidelines for maintaining career materials.
</commit_message>
<xml_diff>
--- a/master/resume.docx
+++ b/master/resume.docx
@@ -41,77 +41,7 @@
           <w:color w:val="525860"/>
           <w:sz w:val="18"/>
         </w:rPr>
-        <w:t>Dhaka, Bangladesh</w:t>
-      </w:r>
-    </w:p>
-    <w:p>
-      <w:pPr>
-        <w:spacing w:after="0"/>
-        <w:jc w:val="center"/>
-      </w:pPr>
-      <w:r>
-        <w:rPr>
-          <w:b w:val="0"/>
-          <w:color w:val="525860"/>
-          <w:sz w:val="18"/>
-        </w:rPr>
-        <w:t>Phone: +8801912070224</w:t>
-      </w:r>
-    </w:p>
-    <w:p>
-      <w:pPr>
-        <w:spacing w:after="0"/>
-        <w:jc w:val="center"/>
-      </w:pPr>
-      <w:r>
-        <w:rPr>
-          <w:b w:val="0"/>
-          <w:color w:val="525860"/>
-          <w:sz w:val="18"/>
-        </w:rPr>
-        <w:t>Email: imran110219@gmail.com</w:t>
-      </w:r>
-    </w:p>
-    <w:p>
-      <w:pPr>
-        <w:spacing w:after="0"/>
-        <w:jc w:val="center"/>
-      </w:pPr>
-      <w:r>
-        <w:rPr>
-          <w:b w:val="0"/>
-          <w:color w:val="525860"/>
-          <w:sz w:val="18"/>
-        </w:rPr>
-        <w:t>LinkedIn: www.linkedin.com/in/sadmansobhan</w:t>
-      </w:r>
-    </w:p>
-    <w:p>
-      <w:pPr>
-        <w:spacing w:after="0"/>
-        <w:jc w:val="center"/>
-      </w:pPr>
-      <w:r>
-        <w:rPr>
-          <w:b w:val="0"/>
-          <w:color w:val="525860"/>
-          <w:sz w:val="18"/>
-        </w:rPr>
-        <w:t>Website: www.sadmansobhan.com</w:t>
-      </w:r>
-    </w:p>
-    <w:p>
-      <w:pPr>
-        <w:spacing w:after="0"/>
-        <w:jc w:val="center"/>
-      </w:pPr>
-      <w:r>
-        <w:rPr>
-          <w:b w:val="0"/>
-          <w:color w:val="525860"/>
-          <w:sz w:val="18"/>
-        </w:rPr>
-        <w:t>GitHub: github.com/imran110219</w:t>
+        <w:t>Dhaka, Bangladesh | Contact via LinkedIn</w:t>
       </w:r>
     </w:p>
     <w:p>
@@ -128,7 +58,7 @@
           <w:color w:val="525860"/>
           <w:sz w:val="18"/>
         </w:rPr>
-        <w:t>Blog: medium.com/@imran110219</w:t>
+        <w:t>LinkedIn: www.linkedin.com/in/sadmansobhan | Website: www.sadmansobhan.com | GitHub: github.com/imran110219</w:t>
       </w:r>
     </w:p>
     <w:p>
@@ -220,7 +150,7 @@
         <w:t xml:space="preserve">•  </w:t>
       </w:r>
       <w:r>
-        <w:t>Helped deliver an election-management platform supporting 50,000 users and approximately 100,000 daily requests during election periods.</w:t>
+        <w:t>Contributed to backend design and delivery across an election platform comprising nearly 25 running services.</w:t>
       </w:r>
     </w:p>
     <w:p>
@@ -236,7 +166,7 @@
         <w:t xml:space="preserve">•  </w:t>
       </w:r>
       <w:r>
-        <w:t>Designed and delivered services across a microservices architecture of nearly 25 running services.</w:t>
+        <w:t>Helped deliver an election-management platform reported to support 50,000 users and approximately 100,000 daily requests during election periods.</w:t>
       </w:r>
     </w:p>
     <w:p>
@@ -441,7 +371,7 @@
         <w:t xml:space="preserve">•  </w:t>
       </w:r>
       <w:r>
-        <w:t>Led backend engineering activities for an Election Management System, including task allocation, grooming, planning, implementation guidance, and code reviews within a 30-person development team.</w:t>
+        <w:t>Lead backend engineering activities for an Election Management System, including task allocation, grooming, planning, implementation guidance, and code reviews within a 30-person development team.</w:t>
       </w:r>
     </w:p>
     <w:p>
@@ -473,7 +403,7 @@
         <w:t xml:space="preserve">•  </w:t>
       </w:r>
       <w:r>
-        <w:t>Led backend delivery for candidate review, nomination lifecycle, verification, status-transition, and payment-linked submission workflows handling sensitive identity, disclosure, and election data.</w:t>
+        <w:t>Lead backend delivery for candidate review, nomination lifecycle, verification, status-transition, and payment-linked submission workflows handling sensitive identity, disclosure, and election data.</w:t>
       </w:r>
     </w:p>
     <w:p>
@@ -489,7 +419,7 @@
         <w:t xml:space="preserve">•  </w:t>
       </w:r>
       <w:r>
-        <w:t>Designed service interactions, REST API contracts, and reporting workflows across a microservices architecture of nearly 25 services; owned a reporting service that consolidated data to generate official nomination, candidate, schedule, and result PDF reports.</w:t>
+        <w:t>Design service interactions, REST API contracts, and reporting workflows across a microservices architecture of nearly 25 services; own a reporting service that consolidates data to generate official nomination, candidate, schedule, and result PDF reports.</w:t>
       </w:r>
     </w:p>
     <w:p>
@@ -505,7 +435,7 @@
         <w:t xml:space="preserve">•  </w:t>
       </w:r>
       <w:r>
-        <w:t>Help deliver an internal system supporting 50,000 users and approximately 100,000 daily requests during election periods, compared with approximately 10,000 requests per day before elections.</w:t>
+        <w:t>Contribute to delivery of an internal system reported to support 50,000 users and approximately 100,000 daily requests during election periods, compared with approximately 10,000 requests per day before elections.</w:t>
       </w:r>
     </w:p>
     <w:p>
@@ -537,7 +467,7 @@
         <w:t xml:space="preserve">•  </w:t>
       </w:r>
       <w:r>
-        <w:t>Digitized result-center, voter, candidate, and percentage-calculation workflows for approximately 300 returning officers; strengthened validation and role-based controls to prevent unwanted data changes.</w:t>
+        <w:t>Digitize result-center, voter, candidate, and percentage-calculation workflows for approximately 300 returning officers; strengthen validation and role-based controls to prevent unwanted data changes.</w:t>
       </w:r>
     </w:p>
     <w:p>
@@ -620,7 +550,7 @@
         <w:t xml:space="preserve">•  </w:t>
       </w:r>
       <w:r>
-        <w:t>Developed a real-time administrator dashboard that improved data visibility and decision-making, contributing to a 40% increase in system usage and user satisfaction.</w:t>
+        <w:t>Built a real-time administrator dashboard associated with a reported 40% increase in system usage; the separate satisfaction outcome is NEEDS REVIEW.</w:t>
       </w:r>
     </w:p>
     <w:p>
@@ -767,7 +697,7 @@
         <w:t xml:space="preserve">•  </w:t>
       </w:r>
       <w:r>
-        <w:t>Helped drive an 80% increase in user engagement over a six-month period through product improvements and stakeholder-aligned delivery.</w:t>
+        <w:t>Contributed to product improvements and stakeholder-aligned delivery; the reported 80% user-engagement outcome requires evidence context before reuse.</w:t>
       </w:r>
     </w:p>
     <w:p>
@@ -895,7 +825,7 @@
         <w:keepNext/>
       </w:pPr>
       <w:r>
-        <w:t>SELECTED PROJECTS</w:t>
+        <w:t>PERSONAL PROJECTS</w:t>
       </w:r>
     </w:p>
     <w:p>
@@ -921,7 +851,7 @@
         <w:t xml:space="preserve">•  </w:t>
       </w:r>
       <w:r>
-        <w:t>Lead contributor to an open-source healthcare-information platform providing searchable doctor, hospital, ambulance, blood-donation, and medical-resource capabilities.</w:t>
+        <w:t>Lead contributor to an open-source healthcare-information platform with searchable doctor, hospital, ambulance, blood-donation, and medical-resource capabilities.</w:t>
       </w:r>
     </w:p>
     <w:p>
@@ -937,7 +867,7 @@
         <w:t xml:space="preserve">•  </w:t>
       </w:r>
       <w:r>
-        <w:t>Built and documented a Spring Boot REST API with PostgreSQL, Keycloak-based JWT authorization, MinIO file storage, Liquibase migrations, Dockerized deployment, and Swagger/OpenAPI documentation.</w:t>
+        <w:t>Built and documented a Spring Boot REST API with PostgreSQL, Redis, Keycloak-based authorization, MinIO file storage, Liquibase migrations, Dockerized deployment, and Swagger/OpenAPI documentation.</w:t>
       </w:r>
     </w:p>
     <w:p>
@@ -963,7 +893,7 @@
         <w:t xml:space="preserve">•  </w:t>
       </w:r>
       <w:r>
-        <w:t>Built and deployed a production editorial platform using a headless CMS architecture with customized content models and API integration.</w:t>
+        <w:t>Production editorial platform using a headless CMS architecture, customized content models, and API integration; individual ownership and CMS implementation details are NEEDS REVIEW.</w:t>
       </w:r>
     </w:p>
     <w:p>

</xml_diff>

<commit_message>
resume: clean applicant content and strengthen architect positioning
</commit_message>
<xml_diff>
--- a/master/resume.docx
+++ b/master/resume.docx
@@ -550,7 +550,7 @@
         <w:t xml:space="preserve">•  </w:t>
       </w:r>
       <w:r>
-        <w:t>Built a real-time administrator dashboard associated with a reported 40% increase in system usage; the separate satisfaction outcome is NEEDS REVIEW.</w:t>
+        <w:t>Built a real-time administrator dashboard associated with a reported 40% increase in system usage.</w:t>
       </w:r>
     </w:p>
     <w:p>
@@ -697,7 +697,7 @@
         <w:t xml:space="preserve">•  </w:t>
       </w:r>
       <w:r>
-        <w:t>Contributed to product improvements and stakeholder-aligned delivery; the reported 80% user-engagement outcome requires evidence context before reuse.</w:t>
+        <w:t>Contributed to product improvements and stakeholder-aligned delivery for a national e-procurement platform.</w:t>
       </w:r>
     </w:p>
     <w:p>
@@ -868,32 +868,6 @@
       </w:r>
       <w:r>
         <w:t>Built and documented a Spring Boot REST API with PostgreSQL, Redis, Keycloak-based authorization, MinIO file storage, Liquibase migrations, Dockerized deployment, and Swagger/OpenAPI documentation.</w:t>
-      </w:r>
-    </w:p>
-    <w:p>
-      <w:pPr>
-        <w:pStyle w:val="DesignedSubsection"/>
-        <w:spacing w:before="90" w:after="10"/>
-        <w:keepNext/>
-      </w:pPr>
-      <w:r>
-        <w:t>FactLens | Headless CMS, Custom Content Models, API Integration</w:t>
-      </w:r>
-    </w:p>
-    <w:p>
-      <w:pPr>
-        <w:spacing w:after="36" w:line="245" w:lineRule="auto"/>
-        <w:ind w:left="245" w:hanging="187"/>
-        <w:keepLines/>
-      </w:pPr>
-      <w:r>
-        <w:rPr>
-          <w:color w:val="1B375C"/>
-        </w:rPr>
-        <w:t xml:space="preserve">•  </w:t>
-      </w:r>
-      <w:r>
-        <w:t>Production editorial platform using a headless CMS architecture, customized content models, and API integration; individual ownership and CMS implementation details are NEEDS REVIEW.</w:t>
       </w:r>
     </w:p>
     <w:p>

</xml_diff>

<commit_message>
Update resumes and project documentation: enhance FactLens entries, standardize project descriptions, and improve resume scripts for personal projects
</commit_message>
<xml_diff>
--- a/master/resume.docx
+++ b/master/resume.docx
@@ -352,6 +352,7 @@
     <w:p>
       <w:pPr>
         <w:spacing w:after="40"/>
+        <w:keepNext/>
         <w:keepLines/>
       </w:pPr>
       <w:r>
@@ -483,6 +484,7 @@
     <w:p>
       <w:pPr>
         <w:spacing w:after="40"/>
+        <w:keepNext/>
         <w:keepLines/>
       </w:pPr>
       <w:r>
@@ -614,6 +616,7 @@
     <w:p>
       <w:pPr>
         <w:spacing w:after="40"/>
+        <w:keepNext/>
         <w:keepLines/>
       </w:pPr>
       <w:r>
@@ -729,6 +732,7 @@
     <w:p>
       <w:pPr>
         <w:spacing w:after="40"/>
+        <w:keepNext/>
         <w:keepLines/>
       </w:pPr>
       <w:r>
@@ -868,6 +872,32 @@
       </w:r>
       <w:r>
         <w:t>Built and documented a Spring Boot REST API with PostgreSQL, Redis, Keycloak-based authorization, MinIO file storage, Liquibase migrations, Dockerized deployment, and Swagger/OpenAPI documentation.</w:t>
+      </w:r>
+    </w:p>
+    <w:p>
+      <w:pPr>
+        <w:pStyle w:val="DesignedSubsection"/>
+        <w:spacing w:before="90" w:after="10"/>
+        <w:keepNext/>
+      </w:pPr>
+      <w:r>
+        <w:t>FactLens | Next.js, Strapi, PostgreSQL, Cloudflare</w:t>
+      </w:r>
+    </w:p>
+    <w:p>
+      <w:pPr>
+        <w:spacing w:after="36" w:line="245" w:lineRule="auto"/>
+        <w:ind w:left="245" w:hanging="187"/>
+        <w:keepLines/>
+      </w:pPr>
+      <w:r>
+        <w:rPr>
+          <w:color w:val="1B375C"/>
+        </w:rPr>
+        <w:t xml:space="preserve">•  </w:t>
+      </w:r>
+      <w:r>
+        <w:t>Built and deployed the full-stack FactLens editorial platform, including the Next.js frontend, Strapi backend and content APIs, PostgreSQL database, and Cloudflare file storage.</w:t>
       </w:r>
     </w:p>
     <w:p>

</xml_diff>

<commit_message>
Add job descriptions for Senior Java Developer at InScale and Backend Engineer at micro1; create skill gaps and evidence backlog document
</commit_message>
<xml_diff>
--- a/master/resume.docx
+++ b/master/resume.docx
@@ -253,7 +253,7 @@
           <w:color w:val="525860"/>
           <w:sz w:val="18"/>
         </w:rPr>
-        <w:t>Backend  |  Spring Boot, Hibernate, REST APIs, Node.js, Express, PDF generation</w:t>
+        <w:t>Backend  |  Spring Boot, Hibernate, REST APIs, PDF generation</w:t>
       </w:r>
     </w:p>
     <w:p>
@@ -281,7 +281,7 @@
           <w:color w:val="525860"/>
           <w:sz w:val="18"/>
         </w:rPr>
-        <w:t>Data &amp; Performance  |  PostgreSQL, SQL Server, Redis, Flyway, query optimization, relational database design</w:t>
+        <w:t>Data &amp; Performance  |  PostgreSQL, SQL Server, Redis, query optimization, relational database design</w:t>
       </w:r>
     </w:p>
     <w:p>

</xml_diff>

<commit_message>
Update resumes and documentation: enhance skills and experience sections with RabbitMQ, CI/CD, and load testing details; refine evidence backlog and skill gaps for clarity.
</commit_message>
<xml_diff>
--- a/master/resume.docx
+++ b/master/resume.docx
@@ -253,7 +253,7 @@
           <w:color w:val="525860"/>
           <w:sz w:val="18"/>
         </w:rPr>
-        <w:t>Backend  |  Spring Boot, Hibernate, REST APIs, PDF generation</w:t>
+        <w:t>Backend  |  Spring Boot, Hibernate, REST APIs, RabbitMQ, PDF generation</w:t>
       </w:r>
     </w:p>
     <w:p>
@@ -309,7 +309,7 @@
           <w:color w:val="525860"/>
           <w:sz w:val="18"/>
         </w:rPr>
-        <w:t>Infrastructure  |  Docker, Kubernetes, deployment troubleshooting</w:t>
+        <w:t>Infrastructure  |  Docker, Kubernetes, Nginx configuration, deployment troubleshooting</w:t>
       </w:r>
     </w:p>
     <w:p>
@@ -323,7 +323,7 @@
           <w:color w:val="525860"/>
           <w:sz w:val="18"/>
         </w:rPr>
-        <w:t>Leadership &amp; Delivery  |  Technical leadership, mentoring, grooming, planning, code reviews, stakeholder collaboration, Agile development</w:t>
+        <w:t>Leadership &amp; Delivery  |  CI/CD, GitHub Actions, Jenkins, Locust load testing, technical leadership, mentoring, grooming, planning, code reviews, stakeholder collaboration, Agile development</w:t>
       </w:r>
     </w:p>
     <w:p>
@@ -388,7 +388,7 @@
         <w:t xml:space="preserve">•  </w:t>
       </w:r>
       <w:r>
-        <w:t>Key technologies: Java, Spring Boot, Hibernate, REST APIs, Docker, Kubernetes, Keycloak.</w:t>
+        <w:t>Key technologies: Java, Spring Boot, Hibernate, REST APIs, RabbitMQ, Docker, Kubernetes, Keycloak, CI/CD, GitHub Actions.</w:t>
       </w:r>
     </w:p>
     <w:p>
@@ -452,7 +452,7 @@
         <w:t xml:space="preserve">•  </w:t>
       </w:r>
       <w:r>
-        <w:t>Contributed to approximately 30 deployments by writing Dockerfiles and diagnosing deployment failures in the organization's self-managed Kubernetes data center.</w:t>
+        <w:t>Contributed to approximately 30 deployments by writing Dockerfiles, configuring Nginx, and diagnosing deployment failures in the organization's self-managed Kubernetes data center; used CI/CD pipelines, including GitHub Actions, across projects.</w:t>
       </w:r>
     </w:p>
     <w:p>
@@ -520,7 +520,7 @@
         <w:t xml:space="preserve">•  </w:t>
       </w:r>
       <w:r>
-        <w:t>Key technologies: Java, Spring Boot, PostgreSQL, Redis, Flutter, Crystal Reports.</w:t>
+        <w:t>Key technologies: Java, Spring Boot, PostgreSQL, Redis, Flutter, Crystal Reports, Jenkins.</w:t>
       </w:r>
     </w:p>
     <w:p>
@@ -569,6 +569,22 @@
       </w:r>
       <w:r>
         <w:t>Reduced system response time by 30% by implementing Redis caching and improving backend performance.</w:t>
+      </w:r>
+    </w:p>
+    <w:p>
+      <w:pPr>
+        <w:spacing w:after="36" w:line="245" w:lineRule="auto"/>
+        <w:ind w:left="245" w:hanging="187"/>
+        <w:keepLines/>
+      </w:pPr>
+      <w:r>
+        <w:rPr>
+          <w:color w:val="1B375C"/>
+        </w:rPr>
+        <w:t xml:space="preserve">•  </w:t>
+      </w:r>
+      <w:r>
+        <w:t>Used Jenkins for CI/CD and Locust for load testing.</w:t>
       </w:r>
     </w:p>
     <w:p>

</xml_diff>

<commit_message>
refactor: update resumes and documentation with new election management system achievements and CI/CD enhancements
</commit_message>
<xml_diff>
--- a/master/resume.docx
+++ b/master/resume.docx
@@ -388,22 +388,6 @@
         <w:t xml:space="preserve">•  </w:t>
       </w:r>
       <w:r>
-        <w:t>Key technologies: Java, Spring Boot, Hibernate, REST APIs, RabbitMQ, Docker, Kubernetes, Keycloak, CI/CD, GitHub Actions.</w:t>
-      </w:r>
-    </w:p>
-    <w:p>
-      <w:pPr>
-        <w:spacing w:after="36" w:line="245" w:lineRule="auto"/>
-        <w:ind w:left="245" w:hanging="187"/>
-        <w:keepLines/>
-      </w:pPr>
-      <w:r>
-        <w:rPr>
-          <w:color w:val="1B375C"/>
-        </w:rPr>
-        <w:t xml:space="preserve">•  </w:t>
-      </w:r>
-      <w:r>
         <w:t>Lead backend delivery for candidate review, nomination lifecycle, verification, status-transition, and payment-linked submission workflows handling sensitive identity, disclosure, and election data.</w:t>
       </w:r>
     </w:p>
@@ -452,7 +436,39 @@
         <w:t xml:space="preserve">•  </w:t>
       </w:r>
       <w:r>
-        <w:t>Contributed to approximately 30 deployments by writing Dockerfiles, configuring Nginx, and diagnosing deployment failures in the organization's self-managed Kubernetes data center; used CI/CD pipelines, including GitHub Actions, across projects.</w:t>
+        <w:t>Contributed to approximately 30 deployments by writing Dockerfiles, configuring Nginx, and diagnosing deployment failures in the organization's self-managed Kubernetes data center; supported 15 weekly deployments during the three months preceding elections.</w:t>
+      </w:r>
+    </w:p>
+    <w:p>
+      <w:pPr>
+        <w:spacing w:after="36" w:line="245" w:lineRule="auto"/>
+        <w:ind w:left="245" w:hanging="187"/>
+        <w:keepLines/>
+      </w:pPr>
+      <w:r>
+        <w:rPr>
+          <w:color w:val="1B375C"/>
+        </w:rPr>
+        <w:t xml:space="preserve">•  </w:t>
+      </w:r>
+      <w:r>
+        <w:t>Implemented application-level routing of center and polling-personnel search reads to PostgreSQL read replicas, improving search responsiveness and reducing load on the primary transactional database.</w:t>
+      </w:r>
+    </w:p>
+    <w:p>
+      <w:pPr>
+        <w:spacing w:after="36" w:line="245" w:lineRule="auto"/>
+        <w:ind w:left="245" w:hanging="187"/>
+        <w:keepLines/>
+      </w:pPr>
+      <w:r>
+        <w:rPr>
+          <w:color w:val="1B375C"/>
+        </w:rPr>
+        <w:t xml:space="preserve">•  </w:t>
+      </w:r>
+      <w:r>
+        <w:t>Configured SonarQube quality gates and Trivy dependency-vulnerability scanning in CI/CD, identifying and remediating critical and high-severity dependency vulnerabilities before release.</w:t>
       </w:r>
     </w:p>
     <w:p>

</xml_diff>

<commit_message>
refactor: update deployment terminology from 'weekly' to 'production' across resumes and documentation for clarity
</commit_message>
<xml_diff>
--- a/master/resume.docx
+++ b/master/resume.docx
@@ -436,7 +436,7 @@
         <w:t xml:space="preserve">•  </w:t>
       </w:r>
       <w:r>
-        <w:t>Contributed to approximately 30 deployments by writing Dockerfiles, configuring Nginx, and diagnosing deployment failures in the organization's self-managed Kubernetes data center; supported 15 weekly deployments during the three months preceding elections.</w:t>
+        <w:t>Contributed to approximately 30 deployments by writing Dockerfiles, configuring Nginx, and diagnosing deployment failures in the organization's self-managed Kubernetes data center; supported 15 production deployments during the three months preceding elections.</w:t>
       </w:r>
     </w:p>
     <w:p>
@@ -484,7 +484,7 @@
         <w:t xml:space="preserve">•  </w:t>
       </w:r>
       <w:r>
-        <w:t>Digitize result-center, voter, candidate, and percentage-calculation workflows for approximately 300 returning officers; strengthen validation and role-based controls to prevent unwanted data changes.</w:t>
+        <w:t>Digitized result-center, voter, candidate, and percentage-calculation workflows for approximately 300 returning officers; strengthened validation and role-based controls to prevent unwanted data changes.</w:t>
       </w:r>
     </w:p>
     <w:p>

</xml_diff>